<commit_message>
Deploy finaliserede elevmaterialer: Karakter-kamp, Escape-room (ELEV), Etiske dilemmaer
- Selvstaendigt laesbare elevark med verificerede kilder og links
- Etiske dilemmaer: fjernet laererafsnit der var synligt for eleverne; tilfoejet filosofportraetter, religionsvinkel og kildeliste
- Escape-room ELEV: nye opgaver (algebra, sandsynlighed) + stilladsering og hints; noedkode opdateret
- Karakter-kamp: intro, kildehenvisninger (lex.dk m.fl.) og anti-gaet-vejledning

Co-Authored-By: Claude Opus 4.8 (1M context) <noreply@anthropic.com>
</commit_message>
<xml_diff>
--- a/Elevark_Karakter-kamp.docx
+++ b/Elevark_Karakter-kamp.docx
@@ -7,7 +7,7 @@
         <w:pStyle w:val="Heading1"/>
       </w:pPr>
       <w:r>
-        <w:t>Karakter-kamp — elevark</w:t>
+        <w:t>⚔️ Karakter-kamp — elevark</w:t>
       </w:r>
     </w:p>
     <w:p>
@@ -15,39 +15,114 @@
         <w:rPr>
           <w:i/>
         </w:rPr>
-        <w:t>Religion &amp; historie · navn: _______________________  klasse: _______  dato: _______</w:t>
+        <w:t>Religion &amp; historie · 8. klasse · navn: _______________________  klasse: _______  dato: _______</w:t>
+      </w:r>
+    </w:p>
+    <w:p>
+      <w:pPr>
+        <w:pStyle w:val="Heading2"/>
+      </w:pPr>
+      <w:r>
+        <w:t>Hvad er det her?</w:t>
       </w:r>
     </w:p>
     <w:p>
       <w:r>
-        <w:t xml:space="preserve">I skal spille med </w:t>
+        <w:rPr>
+          <w:b/>
+        </w:rPr>
+        <w:t>Karakter-kamp</w:t>
+      </w:r>
+      <w:r>
+        <w:t xml:space="preserve"> er et kortspil med </w:t>
       </w:r>
       <w:r>
         <w:rPr>
           <w:b/>
         </w:rPr>
-        <w:t>52 kort</w:t>
+        <w:t>52 berømte personer</w:t>
       </w:r>
       <w:r>
-        <w:t xml:space="preserve"> med berømte personer fra religion og historie. Hver person har fire point-tal (stats). På </w:t>
+        <w:t xml:space="preserve"> fra religion og historie, lige fra Jesus og Buddha til Einstein, Hitler og Nelson Mandela. I spiller to spil med kortene og arbejder bagefter selv videre med personerne. I kan spille og løse arket uden hjælp fra læreren. Alt, hvad I skal vide, står her.</w:t>
+      </w:r>
+    </w:p>
+    <w:p>
+      <w:r>
+        <w:rPr>
+          <w:b/>
+        </w:rPr>
+        <w:t>I skal bruge:</w:t>
+      </w:r>
+      <w:r>
+        <w:t xml:space="preserve"> de 52 kort, denne side og en blyant.</w:t>
+      </w:r>
+    </w:p>
+    <w:p>
+      <w:pPr>
+        <w:pStyle w:val="Heading2"/>
+      </w:pPr>
+      <w:r>
+        <w:t>Sådan er et kort bygget op</w:t>
+      </w:r>
+    </w:p>
+    <w:p>
+      <w:r>
+        <w:t xml:space="preserve">Hver person har et kort med en </w:t>
       </w:r>
       <w:r>
         <w:rPr>
           <w:b/>
         </w:rPr>
-        <w:t>forsiden</w:t>
+        <w:t>forside</w:t>
       </w:r>
       <w:r>
-        <w:t xml:space="preserve"> står navnet og de fire stats. På </w:t>
+        <w:t xml:space="preserve"> og en </w:t>
       </w:r>
       <w:r>
         <w:rPr>
           <w:b/>
         </w:rPr>
-        <w:t>bagsiden</w:t>
+        <w:t>bagside</w:t>
       </w:r>
       <w:r>
-        <w:t xml:space="preserve"> står fakta: </w:t>
+        <w:t>:</w:t>
+      </w:r>
+    </w:p>
+    <w:p>
+      <w:pPr>
+        <w:pStyle w:val="ListBullet"/>
+      </w:pPr>
+      <w:r>
+        <w:rPr>
+          <w:b/>
+        </w:rPr>
+        <w:t>Forsiden:</w:t>
+      </w:r>
+      <w:r>
+        <w:t xml:space="preserve"> personens navn og </w:t>
+      </w:r>
+      <w:r>
+        <w:rPr>
+          <w:b/>
+        </w:rPr>
+        <w:t>fire point-tal (stats)</w:t>
+      </w:r>
+      <w:r>
+        <w:t>.</w:t>
+      </w:r>
+    </w:p>
+    <w:p>
+      <w:pPr>
+        <w:pStyle w:val="ListBullet"/>
+      </w:pPr>
+      <w:r>
+        <w:rPr>
+          <w:b/>
+        </w:rPr>
+        <w:t>Bagsiden:</w:t>
+      </w:r>
+      <w:r>
+        <w:t xml:space="preserve"> fakta om personen, altså </w:t>
       </w:r>
       <w:r>
         <w:rPr>
@@ -61,100 +136,84 @@
     </w:p>
     <w:p>
       <w:pPr>
-        <w:ind w:left="360"/>
+        <w:shd w:val="clear" w:fill="EEF1F6"/>
+        <w:ind w:left="259" w:right="144"/>
       </w:pPr>
       <w:r>
         <w:rPr>
-          <w:i/>
+          <w:b/>
         </w:rPr>
-        <w:t xml:space="preserve">De fire stats: ⏳ </w:t>
+        <w:t>De fire stats:</w:t>
+      </w:r>
+      <w:r>
+        <w:t xml:space="preserve"> ⏳ </w:t>
       </w:r>
       <w:r>
         <w:rPr>
           <w:b/>
-          <w:i/>
         </w:rPr>
         <w:t>Alder</w:t>
+      </w:r>
+      <w:r>
+        <w:t xml:space="preserve"> (hvor langt tilbage personen levede) · 🌍 </w:t>
+      </w:r>
+      <w:r>
+        <w:rPr>
+          <w:b/>
+        </w:rPr>
+        <w:t>Indflydelse</w:t>
+      </w:r>
+      <w:r>
+        <w:t xml:space="preserve"> (hvor meget personen ændrede historien, på godt og ondt) · 👥 </w:t>
+      </w:r>
+      <w:r>
+        <w:rPr>
+          <w:b/>
+        </w:rPr>
+        <w:t>Udbredelse</w:t>
+      </w:r>
+      <w:r>
+        <w:t xml:space="preserve"> (hvor mange mennesker det berører) · ⭐ </w:t>
+      </w:r>
+      <w:r>
+        <w:rPr>
+          <w:b/>
+        </w:rPr>
+        <w:t>Eftermæle</w:t>
+      </w:r>
+      <w:r>
+        <w:t xml:space="preserve"> (hvor kendt personen er i dag).</w:t>
+      </w:r>
+    </w:p>
+    <w:p>
+      <w:pPr>
+        <w:shd w:val="clear" w:fill="EEF1F6"/>
+        <w:ind w:left="259" w:right="144"/>
+      </w:pPr>
+      <w:r>
+        <w:rPr>
+          <w:b/>
+        </w:rPr>
+        <w:t>Vigtigt:</w:t>
+      </w:r>
+      <w:r>
+        <w:t xml:space="preserve"> Et højt tal betyder stor betydning. Det betyder </w:t>
       </w:r>
       <w:r>
         <w:rPr>
           <w:i/>
         </w:rPr>
-        <w:t xml:space="preserve"> (hvor langt tilbage) · 🌍 </w:t>
+        <w:t>ikke</w:t>
       </w:r>
       <w:r>
-        <w:rPr>
-          <w:b/>
-          <w:i/>
-        </w:rPr>
-        <w:t>Indflydelse</w:t>
-      </w:r>
-      <w:r>
-        <w:rPr>
-          <w:i/>
-        </w:rPr>
-        <w:t xml:space="preserve"> (hvor meget personen ændrede historien — på godt og ondt) · 👥 </w:t>
-      </w:r>
-      <w:r>
-        <w:rPr>
-          <w:b/>
-          <w:i/>
-        </w:rPr>
-        <w:t>Udbredelse</w:t>
-      </w:r>
-      <w:r>
-        <w:rPr>
-          <w:i/>
-        </w:rPr>
-        <w:t xml:space="preserve"> (hvor mange mennesker) · ⭐ </w:t>
-      </w:r>
-      <w:r>
-        <w:rPr>
-          <w:b/>
-          <w:i/>
-        </w:rPr>
-        <w:t>Eftermæle</w:t>
-      </w:r>
-      <w:r>
-        <w:rPr>
-          <w:i/>
-        </w:rPr>
-        <w:t xml:space="preserve"> (hvor kendt i dag).</w:t>
+        <w:t>, at personen var "god". Nogle af de mest indflydelsesrige mennesker i historien gjorde frygtelige ting.</w:t>
       </w:r>
     </w:p>
     <w:p>
       <w:pPr>
-        <w:ind w:left="360"/>
-      </w:pPr>
-      <w:r>
-        <w:rPr>
-          <w:b/>
-          <w:i/>
-        </w:rPr>
-        <w:t>Husk:</w:t>
-      </w:r>
-      <w:r>
-        <w:rPr>
-          <w:i/>
-        </w:rPr>
-        <w:t xml:space="preserve"> Et højt tal betyder </w:t>
-      </w:r>
-      <w:r>
-        <w:rPr>
-          <w:i/>
-        </w:rPr>
-        <w:t>stor betydning</w:t>
-      </w:r>
-      <w:r>
-        <w:rPr>
-          <w:i/>
-        </w:rPr>
-        <w:t xml:space="preserve"> — ikke at personen var "god". Nogle af de mest indflydelsesrige personer gjorde frygtelige ting.</w:t>
-      </w:r>
-    </w:p>
-    <w:p>
-      <w:pPr>
-        <w:spacing w:before="40" w:after="120"/>
+        <w:pBdr>
+          <w:bottom w:val="single" w:sz="6" w:space="1" w:color="BBBBBB"/>
+        </w:pBdr>
       </w:pPr>
     </w:p>
     <w:p>
@@ -166,8 +225,11 @@
       </w:r>
     </w:p>
     <w:p>
+      <w:pPr>
+        <w:pStyle w:val="ListNumber"/>
+      </w:pPr>
       <w:r>
-        <w:t xml:space="preserve">1. Bland kortene og del dem </w:t>
+        <w:t xml:space="preserve">Bland kortene, og del dem </w:t>
       </w:r>
       <w:r>
         <w:rPr>
@@ -176,7 +238,15 @@
         <w:t>ligeligt</w:t>
       </w:r>
       <w:r>
-        <w:t xml:space="preserve"> (26 til hver). Hold jeres bunke, så I ikke kan se modstanderens. 2. Den, der har tur, ser sit øverste kort og vælger </w:t>
+        <w:t xml:space="preserve"> (26 til hver). Hold jeres bunke, så modstanderen ikke kan se den.</w:t>
+      </w:r>
+    </w:p>
+    <w:p>
+      <w:pPr>
+        <w:pStyle w:val="ListNumber"/>
+      </w:pPr>
+      <w:r>
+        <w:t xml:space="preserve">Den, der har tur, ser sit øverste kort og vælger </w:t>
       </w:r>
       <w:r>
         <w:rPr>
@@ -185,7 +255,15 @@
         <w:t>én stat</w:t>
       </w:r>
       <w:r>
-        <w:t xml:space="preserve"> (fx 🌍 Indflydelse). 3. I vender begge øverste kort. </w:t>
+        <w:t xml:space="preserve"> (fx 🌍 Indflydelse).</w:t>
+      </w:r>
+    </w:p>
+    <w:p>
+      <w:pPr>
+        <w:pStyle w:val="ListNumber"/>
+      </w:pPr>
+      <w:r>
+        <w:t xml:space="preserve">I vender begge jeres øverste kort. </w:t>
       </w:r>
       <w:r>
         <w:rPr>
@@ -194,8 +272,13 @@
         <w:t>Højeste tal vinder</w:t>
       </w:r>
       <w:r>
-        <w:t xml:space="preserve"> begge kort — læg dem nederst i din bunke. 4. </w:t>
+        <w:t xml:space="preserve"> begge kort. Læg dem nederst i din bunke.</w:t>
       </w:r>
+    </w:p>
+    <w:p>
+      <w:pPr>
+        <w:pStyle w:val="ListNumber"/>
+      </w:pPr>
       <w:r>
         <w:rPr>
           <w:b/>
@@ -203,8 +286,21 @@
         <w:t>Uafgjort?</w:t>
       </w:r>
       <w:r>
-        <w:t xml:space="preserve"> Læg kortene i en bunke i midten. Vinderen af næste runde tager dem. 5. Den, der vandt, vælger næste stat. 6. </w:t>
+        <w:t xml:space="preserve"> Læg kortene i en bunke i midten. Vinderen af næste runde tager dem alle.</w:t>
       </w:r>
+    </w:p>
+    <w:p>
+      <w:pPr>
+        <w:pStyle w:val="ListNumber"/>
+      </w:pPr>
+      <w:r>
+        <w:t>Den, der vandt, vælger næste stat.</w:t>
+      </w:r>
+    </w:p>
+    <w:p>
+      <w:pPr>
+        <w:pStyle w:val="ListNumber"/>
+      </w:pPr>
       <w:r>
         <w:rPr>
           <w:b/>
@@ -212,7 +308,7 @@
         <w:t>Vinder:</w:t>
       </w:r>
       <w:r>
-        <w:t xml:space="preserve"> den, der til sidst har alle kort — eller flest, når I stopper.</w:t>
+        <w:t xml:space="preserve"> den, der til sidst har alle kort, eller flest, når I stopper.</w:t>
       </w:r>
     </w:p>
     <w:p>
@@ -223,21 +319,23 @@
         <w:t>Spil-snak:</w:t>
       </w:r>
       <w:r>
-        <w:t xml:space="preserve"> Når du vælger en stat, så sig </w:t>
+        <w:t xml:space="preserve"> Når du vælger en stat, så sig hvorfor din person er stærk på den ("</w:t>
       </w:r>
       <w:r>
         <w:rPr>
           <w:i/>
         </w:rPr>
-        <w:t>hvorfor</w:t>
+        <w:t>Einstein har højt eftermæle, fordi han stadig er verdenskendt</w:t>
       </w:r>
       <w:r>
-        <w:t xml:space="preserve"> din person er stærk på den ("Einstein har høj eftermæle, fordi han stadig er verdenskendt").</w:t>
+        <w:t>").</w:t>
       </w:r>
     </w:p>
     <w:p>
       <w:pPr>
-        <w:spacing w:before="40" w:after="120"/>
+        <w:pBdr>
+          <w:bottom w:val="single" w:sz="6" w:space="1" w:color="BBBBBB"/>
+        </w:pBdr>
       </w:pPr>
     </w:p>
     <w:p>
@@ -249,26 +347,44 @@
       </w:r>
     </w:p>
     <w:p>
+      <w:pPr>
+        <w:pStyle w:val="ListNumber"/>
+      </w:pPr>
       <w:r>
-        <w:t xml:space="preserve">1. Læg ét kort på bordet som start. 2. Træk et nyt kort. </w:t>
+        <w:t>Læg ét kort på bordet som start.</w:t>
+      </w:r>
+    </w:p>
+    <w:p>
+      <w:pPr>
+        <w:pStyle w:val="ListNumber"/>
+      </w:pPr>
+      <w:r>
+        <w:t xml:space="preserve">Træk et nyt kort. </w:t>
       </w:r>
       <w:r>
         <w:rPr>
           <w:b/>
         </w:rPr>
-        <w:t>Kig kun på navnet — ikke årstallet!</w:t>
+        <w:t>Kig kun på navnet, ikke på bagsiden!</w:t>
       </w:r>
       <w:r>
-        <w:t xml:space="preserve"> Hvor på tidslinjen hører personen til? (ældst til venstre) 3. Læg kortet, hvor I tror, det skal være. </w:t>
+        <w:t xml:space="preserve"> Hvor på tidslinjen hører personen til? (ældst til venstre)</w:t>
       </w:r>
+    </w:p>
+    <w:p>
+      <w:pPr>
+        <w:pStyle w:val="ListNumber"/>
+      </w:pPr>
       <w:r>
-        <w:rPr>
-          <w:b/>
-        </w:rPr>
-        <w:t>Vend det</w:t>
+        <w:t>Læg kortet, hvor I tror, det skal ligge. Vend det så om, og tjek årstallet på bagsiden.</w:t>
       </w:r>
+    </w:p>
+    <w:p>
+      <w:pPr>
+        <w:pStyle w:val="ListNumber"/>
+      </w:pPr>
       <w:r>
-        <w:t xml:space="preserve"> og tjek årstallet på bagsiden. 4. Rigtigt = </w:t>
+        <w:t xml:space="preserve">Rigtigt = </w:t>
       </w:r>
       <w:r>
         <w:rPr>
@@ -282,7 +398,9 @@
     </w:p>
     <w:p>
       <w:pPr>
-        <w:spacing w:before="40" w:after="120"/>
+        <w:pBdr>
+          <w:bottom w:val="single" w:sz="6" w:space="1" w:color="BBBBBB"/>
+        </w:pBdr>
       </w:pPr>
     </w:p>
     <w:p>
@@ -300,7 +418,7 @@
     </w:p>
     <w:tbl>
       <w:tblPr>
-        <w:tblStyle w:val="TableGrid"/>
+        <w:tblStyle w:val="LightGrid-Accent1"/>
         <w:tblW w:type="auto" w:w="0"/>
         <w:tblLook w:firstColumn="1" w:firstRow="1" w:lastColumn="0" w:lastRow="0" w:noHBand="0" w:noVBand="1" w:val="04A0"/>
       </w:tblPr>
@@ -320,6 +438,11 @@
               <w:rPr>
                 <w:b/>
               </w:rPr>
+            </w:r>
+            <w:r>
+              <w:rPr>
+                <w:b/>
+              </w:rPr>
               <w:t>#</w:t>
             </w:r>
           </w:p>
@@ -329,6 +452,11 @@
             <w:tcW w:type="dxa" w:w="2160"/>
           </w:tcPr>
           <w:p>
+            <w:r>
+              <w:rPr>
+                <w:b/>
+              </w:rPr>
+            </w:r>
             <w:r>
               <w:rPr>
                 <w:b/>
@@ -346,6 +474,11 @@
               <w:rPr>
                 <w:b/>
               </w:rPr>
+            </w:r>
+            <w:r>
+              <w:rPr>
+                <w:b/>
+              </w:rPr>
               <w:t>Årstal</w:t>
             </w:r>
           </w:p>
@@ -355,6 +488,11 @@
             <w:tcW w:type="dxa" w:w="2160"/>
           </w:tcPr>
           <w:p>
+            <w:r>
+              <w:rPr>
+                <w:b/>
+              </w:rPr>
+            </w:r>
             <w:r>
               <w:rPr>
                 <w:b/>
@@ -370,6 +508,7 @@
             <w:tcW w:type="dxa" w:w="2160"/>
           </w:tcPr>
           <w:p>
+            <w:r/>
             <w:r>
               <w:t>1</w:t>
             </w:r>
@@ -379,19 +518,25 @@
           <w:tcPr>
             <w:tcW w:type="dxa" w:w="2160"/>
           </w:tcPr>
-          <w:p/>
+          <w:p>
+            <w:r/>
+          </w:p>
         </w:tc>
         <w:tc>
           <w:tcPr>
             <w:tcW w:type="dxa" w:w="2160"/>
           </w:tcPr>
-          <w:p/>
+          <w:p>
+            <w:r/>
+          </w:p>
         </w:tc>
         <w:tc>
           <w:tcPr>
             <w:tcW w:type="dxa" w:w="2160"/>
           </w:tcPr>
-          <w:p/>
+          <w:p>
+            <w:r/>
+          </w:p>
         </w:tc>
       </w:tr>
       <w:tr>
@@ -400,6 +545,7 @@
             <w:tcW w:type="dxa" w:w="2160"/>
           </w:tcPr>
           <w:p>
+            <w:r/>
             <w:r>
               <w:t>2</w:t>
             </w:r>
@@ -409,19 +555,25 @@
           <w:tcPr>
             <w:tcW w:type="dxa" w:w="2160"/>
           </w:tcPr>
-          <w:p/>
+          <w:p>
+            <w:r/>
+          </w:p>
         </w:tc>
         <w:tc>
           <w:tcPr>
             <w:tcW w:type="dxa" w:w="2160"/>
           </w:tcPr>
-          <w:p/>
+          <w:p>
+            <w:r/>
+          </w:p>
         </w:tc>
         <w:tc>
           <w:tcPr>
             <w:tcW w:type="dxa" w:w="2160"/>
           </w:tcPr>
-          <w:p/>
+          <w:p>
+            <w:r/>
+          </w:p>
         </w:tc>
       </w:tr>
       <w:tr>
@@ -430,6 +582,7 @@
             <w:tcW w:type="dxa" w:w="2160"/>
           </w:tcPr>
           <w:p>
+            <w:r/>
             <w:r>
               <w:t>3</w:t>
             </w:r>
@@ -439,19 +592,25 @@
           <w:tcPr>
             <w:tcW w:type="dxa" w:w="2160"/>
           </w:tcPr>
-          <w:p/>
+          <w:p>
+            <w:r/>
+          </w:p>
         </w:tc>
         <w:tc>
           <w:tcPr>
             <w:tcW w:type="dxa" w:w="2160"/>
           </w:tcPr>
-          <w:p/>
+          <w:p>
+            <w:r/>
+          </w:p>
         </w:tc>
         <w:tc>
           <w:tcPr>
             <w:tcW w:type="dxa" w:w="2160"/>
           </w:tcPr>
-          <w:p/>
+          <w:p>
+            <w:r/>
+          </w:p>
         </w:tc>
       </w:tr>
       <w:tr>
@@ -460,6 +619,7 @@
             <w:tcW w:type="dxa" w:w="2160"/>
           </w:tcPr>
           <w:p>
+            <w:r/>
             <w:r>
               <w:t>4</w:t>
             </w:r>
@@ -469,19 +629,25 @@
           <w:tcPr>
             <w:tcW w:type="dxa" w:w="2160"/>
           </w:tcPr>
-          <w:p/>
+          <w:p>
+            <w:r/>
+          </w:p>
         </w:tc>
         <w:tc>
           <w:tcPr>
             <w:tcW w:type="dxa" w:w="2160"/>
           </w:tcPr>
-          <w:p/>
+          <w:p>
+            <w:r/>
+          </w:p>
         </w:tc>
         <w:tc>
           <w:tcPr>
             <w:tcW w:type="dxa" w:w="2160"/>
           </w:tcPr>
-          <w:p/>
+          <w:p>
+            <w:r/>
+          </w:p>
         </w:tc>
       </w:tr>
       <w:tr>
@@ -490,6 +656,7 @@
             <w:tcW w:type="dxa" w:w="2160"/>
           </w:tcPr>
           <w:p>
+            <w:r/>
             <w:r>
               <w:t>5</w:t>
             </w:r>
@@ -499,19 +666,25 @@
           <w:tcPr>
             <w:tcW w:type="dxa" w:w="2160"/>
           </w:tcPr>
-          <w:p/>
+          <w:p>
+            <w:r/>
+          </w:p>
         </w:tc>
         <w:tc>
           <w:tcPr>
             <w:tcW w:type="dxa" w:w="2160"/>
           </w:tcPr>
-          <w:p/>
+          <w:p>
+            <w:r/>
+          </w:p>
         </w:tc>
         <w:tc>
           <w:tcPr>
             <w:tcW w:type="dxa" w:w="2160"/>
           </w:tcPr>
-          <w:p/>
+          <w:p>
+            <w:r/>
+          </w:p>
         </w:tc>
       </w:tr>
       <w:tr>
@@ -520,6 +693,7 @@
             <w:tcW w:type="dxa" w:w="2160"/>
           </w:tcPr>
           <w:p>
+            <w:r/>
             <w:r>
               <w:t>6</w:t>
             </w:r>
@@ -529,19 +703,25 @@
           <w:tcPr>
             <w:tcW w:type="dxa" w:w="2160"/>
           </w:tcPr>
-          <w:p/>
+          <w:p>
+            <w:r/>
+          </w:p>
         </w:tc>
         <w:tc>
           <w:tcPr>
             <w:tcW w:type="dxa" w:w="2160"/>
           </w:tcPr>
-          <w:p/>
+          <w:p>
+            <w:r/>
+          </w:p>
         </w:tc>
         <w:tc>
           <w:tcPr>
             <w:tcW w:type="dxa" w:w="2160"/>
           </w:tcPr>
-          <w:p/>
+          <w:p>
+            <w:r/>
+          </w:p>
         </w:tc>
       </w:tr>
       <w:tr>
@@ -550,6 +730,7 @@
             <w:tcW w:type="dxa" w:w="2160"/>
           </w:tcPr>
           <w:p>
+            <w:r/>
             <w:r>
               <w:t>7</w:t>
             </w:r>
@@ -559,19 +740,25 @@
           <w:tcPr>
             <w:tcW w:type="dxa" w:w="2160"/>
           </w:tcPr>
-          <w:p/>
+          <w:p>
+            <w:r/>
+          </w:p>
         </w:tc>
         <w:tc>
           <w:tcPr>
             <w:tcW w:type="dxa" w:w="2160"/>
           </w:tcPr>
-          <w:p/>
+          <w:p>
+            <w:r/>
+          </w:p>
         </w:tc>
         <w:tc>
           <w:tcPr>
             <w:tcW w:type="dxa" w:w="2160"/>
           </w:tcPr>
-          <w:p/>
+          <w:p>
+            <w:r/>
+          </w:p>
         </w:tc>
       </w:tr>
       <w:tr>
@@ -580,6 +767,7 @@
             <w:tcW w:type="dxa" w:w="2160"/>
           </w:tcPr>
           <w:p>
+            <w:r/>
             <w:r>
               <w:t>8</w:t>
             </w:r>
@@ -589,23 +777,28 @@
           <w:tcPr>
             <w:tcW w:type="dxa" w:w="2160"/>
           </w:tcPr>
-          <w:p/>
+          <w:p>
+            <w:r/>
+          </w:p>
         </w:tc>
         <w:tc>
           <w:tcPr>
             <w:tcW w:type="dxa" w:w="2160"/>
           </w:tcPr>
-          <w:p/>
+          <w:p>
+            <w:r/>
+          </w:p>
         </w:tc>
         <w:tc>
           <w:tcPr>
             <w:tcW w:type="dxa" w:w="2160"/>
           </w:tcPr>
-          <w:p/>
+          <w:p>
+            <w:r/>
+          </w:p>
         </w:tc>
       </w:tr>
     </w:tbl>
-    <w:p/>
     <w:p>
       <w:r>
         <w:rPr>
@@ -622,7 +815,7 @@
         <w:rPr>
           <w:b/>
         </w:rPr>
-        <w:t>Hvilken person overraskede dig mest (var ældre/yngre end du troede)?</w:t>
+        <w:t>Hvilken person overraskede dig mest (var ældre eller yngre, end du troede)?</w:t>
       </w:r>
       <w:r>
         <w:t xml:space="preserve"> ______________________</w:t>
@@ -630,7 +823,9 @@
     </w:p>
     <w:p>
       <w:pPr>
-        <w:spacing w:before="40" w:after="120"/>
+        <w:pBdr>
+          <w:bottom w:val="single" w:sz="6" w:space="1" w:color="BBBBBB"/>
+        </w:pBdr>
       </w:pPr>
     </w:p>
     <w:p>
@@ -643,22 +838,22 @@
     </w:p>
     <w:p>
       <w:r>
-        <w:t xml:space="preserve">Én læser bagsiden op (hvornår · hvem · hvad · konsekvens) </w:t>
+        <w:t>Én læser bagsiden op (</w:t>
       </w:r>
       <w:r>
         <w:rPr>
-          <w:b/>
+          <w:i/>
         </w:rPr>
-        <w:t>uden</w:t>
+        <w:t>hvornår · hvem · hvad · konsekvens</w:t>
       </w:r>
       <w:r>
-        <w:t xml:space="preserve"> at sige navnet. De andre gætter. Skriv tre personer, I gættede, og ét nyt, du lærte om dem:</w:t>
+        <w:t>) uden at sige navnet. De andre gætter. Skriv tre personer, I gættede, og én ny ting, du lærte om hver:</w:t>
       </w:r>
     </w:p>
     <w:p>
-      <w:r>
-        <w:t xml:space="preserve">1. </w:t>
-      </w:r>
+      <w:pPr>
+        <w:pStyle w:val="ListNumber"/>
+      </w:pPr>
       <w:r>
         <w:rPr>
           <w:b/>
@@ -672,11 +867,16 @@
         <w:rPr>
           <w:b/>
         </w:rPr>
-        <w:t>Noget nyt jeg lærte:</w:t>
+        <w:t>Noget nyt, jeg lærte:</w:t>
       </w:r>
       <w:r>
-        <w:t xml:space="preserve"> ____________________________________ 2. </w:t>
+        <w:t xml:space="preserve"> ____________________________________</w:t>
       </w:r>
+    </w:p>
+    <w:p>
+      <w:pPr>
+        <w:pStyle w:val="ListNumber"/>
+      </w:pPr>
       <w:r>
         <w:rPr>
           <w:b/>
@@ -690,11 +890,16 @@
         <w:rPr>
           <w:b/>
         </w:rPr>
-        <w:t>Noget nyt jeg lærte:</w:t>
+        <w:t>Noget nyt, jeg lærte:</w:t>
       </w:r>
       <w:r>
-        <w:t xml:space="preserve"> ____________________________________ 3. </w:t>
+        <w:t xml:space="preserve"> ____________________________________</w:t>
       </w:r>
+    </w:p>
+    <w:p>
+      <w:pPr>
+        <w:pStyle w:val="ListNumber"/>
+      </w:pPr>
       <w:r>
         <w:rPr>
           <w:b/>
@@ -708,7 +913,7 @@
         <w:rPr>
           <w:b/>
         </w:rPr>
-        <w:t>Noget nyt jeg lærte:</w:t>
+        <w:t>Noget nyt, jeg lærte:</w:t>
       </w:r>
       <w:r>
         <w:t xml:space="preserve"> ____________________________________</w:t>
@@ -716,7 +921,9 @@
     </w:p>
     <w:p>
       <w:pPr>
-        <w:spacing w:before="40" w:after="120"/>
+        <w:pBdr>
+          <w:bottom w:val="single" w:sz="6" w:space="1" w:color="BBBBBB"/>
+        </w:pBdr>
       </w:pPr>
     </w:p>
     <w:p>
@@ -738,16 +945,46 @@
         <w:t>mangler</w:t>
       </w:r>
       <w:r>
-        <w:t xml:space="preserve"> i dækket (spørg evt. din lærer). Lav et nyt kort om personen. Brug en bog eller nettet til at finde fakta — og </w:t>
+        <w:t xml:space="preserve"> i dækket (spørg eventuelt din lærer). Lav et nyt kort om personen, og begrund dine point-tal.</w:t>
       </w:r>
+    </w:p>
+    <w:p>
+      <w:pPr>
+        <w:shd w:val="clear" w:fill="EEF1F6"/>
+        <w:ind w:left="259" w:right="144"/>
+      </w:pPr>
       <w:r>
         <w:rPr>
           <w:b/>
         </w:rPr>
-        <w:t>begrund</w:t>
+        <w:t>🔎 Slå op, og tjek dine fakta</w:t>
       </w:r>
       <w:r>
-        <w:t xml:space="preserve"> dine point-tal.</w:t>
+        <w:t xml:space="preserve"> (pålidelige danske sider): </w:t>
+      </w:r>
+      <w:hyperlink r:id="rId9">
+        <w:r>
+          <w:rPr>
+            <w:color w:val="0563C1"/>
+            <w:u w:val="single"/>
+          </w:rPr>
+          <w:t xml:space="preserve">lex.dk</w:t>
+        </w:r>
+      </w:hyperlink>
+      <w:r>
+        <w:t xml:space="preserve"> (Den Store Danske / Trap Danmark) og </w:t>
+      </w:r>
+      <w:hyperlink r:id="rId10">
+        <w:r>
+          <w:rPr>
+            <w:color w:val="0563C1"/>
+            <w:u w:val="single"/>
+          </w:rPr>
+          <w:t xml:space="preserve">danmarkshistorien.dk</w:t>
+        </w:r>
+      </w:hyperlink>
+      <w:r>
+        <w:t xml:space="preserve"> (Aarhus Universitet). Skriv kun fakta, du har tjekket, ikke noget du "tror".</w:t>
       </w:r>
     </w:p>
     <w:p>
@@ -839,12 +1076,12 @@
         <w:rPr>
           <w:b/>
         </w:rPr>
-        <w:t>Forsiden (point 1-100) — skriv en kort begrundelse for hvert tal:</w:t>
+        <w:t>Forsiden (point 1–100), skriv en kort begrundelse for hvert tal:</w:t>
       </w:r>
     </w:p>
     <w:tbl>
       <w:tblPr>
-        <w:tblStyle w:val="TableGrid"/>
+        <w:tblStyle w:val="LightGrid-Accent1"/>
         <w:tblW w:type="auto" w:w="0"/>
         <w:tblLook w:firstColumn="1" w:firstRow="1" w:lastColumn="0" w:lastRow="0" w:noHBand="0" w:noVBand="1" w:val="04A0"/>
       </w:tblPr>
@@ -863,6 +1100,11 @@
               <w:rPr>
                 <w:b/>
               </w:rPr>
+            </w:r>
+            <w:r>
+              <w:rPr>
+                <w:b/>
+              </w:rPr>
               <w:t>Stat</w:t>
             </w:r>
           </w:p>
@@ -876,7 +1118,12 @@
               <w:rPr>
                 <w:b/>
               </w:rPr>
-              <w:t>Tal (1-100)</w:t>
+            </w:r>
+            <w:r>
+              <w:rPr>
+                <w:b/>
+              </w:rPr>
+              <w:t>Tal (1–100)</w:t>
             </w:r>
           </w:p>
         </w:tc>
@@ -885,6 +1132,11 @@
             <w:tcW w:type="dxa" w:w="2880"/>
           </w:tcPr>
           <w:p>
+            <w:r>
+              <w:rPr>
+                <w:b/>
+              </w:rPr>
+            </w:r>
             <w:r>
               <w:rPr>
                 <w:b/>
@@ -900,6 +1152,7 @@
             <w:tcW w:type="dxa" w:w="2880"/>
           </w:tcPr>
           <w:p>
+            <w:r/>
             <w:r>
               <w:t>⏳ Alder</w:t>
             </w:r>
@@ -909,13 +1162,17 @@
           <w:tcPr>
             <w:tcW w:type="dxa" w:w="2880"/>
           </w:tcPr>
-          <w:p/>
+          <w:p>
+            <w:r/>
+          </w:p>
         </w:tc>
         <w:tc>
           <w:tcPr>
             <w:tcW w:type="dxa" w:w="2880"/>
           </w:tcPr>
-          <w:p/>
+          <w:p>
+            <w:r/>
+          </w:p>
         </w:tc>
       </w:tr>
       <w:tr>
@@ -924,6 +1181,7 @@
             <w:tcW w:type="dxa" w:w="2880"/>
           </w:tcPr>
           <w:p>
+            <w:r/>
             <w:r>
               <w:t>🌍 Indflydelse</w:t>
             </w:r>
@@ -933,13 +1191,17 @@
           <w:tcPr>
             <w:tcW w:type="dxa" w:w="2880"/>
           </w:tcPr>
-          <w:p/>
+          <w:p>
+            <w:r/>
+          </w:p>
         </w:tc>
         <w:tc>
           <w:tcPr>
             <w:tcW w:type="dxa" w:w="2880"/>
           </w:tcPr>
-          <w:p/>
+          <w:p>
+            <w:r/>
+          </w:p>
         </w:tc>
       </w:tr>
       <w:tr>
@@ -948,6 +1210,7 @@
             <w:tcW w:type="dxa" w:w="2880"/>
           </w:tcPr>
           <w:p>
+            <w:r/>
             <w:r>
               <w:t>👥 Udbredelse</w:t>
             </w:r>
@@ -957,13 +1220,17 @@
           <w:tcPr>
             <w:tcW w:type="dxa" w:w="2880"/>
           </w:tcPr>
-          <w:p/>
+          <w:p>
+            <w:r/>
+          </w:p>
         </w:tc>
         <w:tc>
           <w:tcPr>
             <w:tcW w:type="dxa" w:w="2880"/>
           </w:tcPr>
-          <w:p/>
+          <w:p>
+            <w:r/>
+          </w:p>
         </w:tc>
       </w:tr>
       <w:tr>
@@ -972,6 +1239,7 @@
             <w:tcW w:type="dxa" w:w="2880"/>
           </w:tcPr>
           <w:p>
+            <w:r/>
             <w:r>
               <w:t>⭐ Eftermæle</w:t>
             </w:r>
@@ -981,17 +1249,20 @@
           <w:tcPr>
             <w:tcW w:type="dxa" w:w="2880"/>
           </w:tcPr>
-          <w:p/>
+          <w:p>
+            <w:r/>
+          </w:p>
         </w:tc>
         <w:tc>
           <w:tcPr>
             <w:tcW w:type="dxa" w:w="2880"/>
           </w:tcPr>
-          <w:p/>
+          <w:p>
+            <w:r/>
+          </w:p>
         </w:tc>
       </w:tr>
     </w:tbl>
-    <w:p/>
     <w:p>
       <w:r>
         <w:rPr>
@@ -1000,12 +1271,14 @@
         <w:t>Hvorfor fortjener netop denne person en plads i dækket?</w:t>
       </w:r>
       <w:r>
-        <w:t xml:space="preserve"> _______________________________________________________________________________ _______________________________________________________________________________</w:t>
+        <w:t xml:space="preserve"> _______________________________________________________________________________</w:t>
       </w:r>
     </w:p>
     <w:p>
       <w:pPr>
-        <w:spacing w:before="40" w:after="120"/>
+        <w:pBdr>
+          <w:bottom w:val="single" w:sz="6" w:space="1" w:color="BBBBBB"/>
+        </w:pBdr>
       </w:pPr>
     </w:p>
     <w:p>
@@ -1017,9 +1290,9 @@
       </w:r>
     </w:p>
     <w:p>
-      <w:r>
-        <w:t xml:space="preserve">1. </w:t>
-      </w:r>
+      <w:pPr>
+        <w:pStyle w:val="ListNumber"/>
+      </w:pPr>
       <w:r>
         <w:rPr>
           <w:b/>
@@ -1027,13 +1300,13 @@
         <w:t>Kan man måle et menneskes betydning med tal?</w:t>
       </w:r>
       <w:r>
-        <w:t xml:space="preserve"> Hvad fanger tallene godt — og hvad går tabt? _______________________________________________________________________________</w:t>
+        <w:t xml:space="preserve"> Hvad fanger tallene godt, og hvad går tabt? _______________________________________________________________________________</w:t>
       </w:r>
     </w:p>
     <w:p>
-      <w:r>
-        <w:t xml:space="preserve">2. </w:t>
-      </w:r>
+      <w:pPr>
+        <w:pStyle w:val="ListNumber"/>
+      </w:pPr>
       <w:r>
         <w:rPr>
           <w:b/>
@@ -1041,13 +1314,13 @@
         <w:t>Kig på de 52 kort. Hvem mangler?</w:t>
       </w:r>
       <w:r>
-        <w:t xml:space="preserve"> (fx kvinder, almindelige mennesker, personer fra andre dele af verden). Hvad fortæller det om, hvem vi plejer at huske? _______________________________________________________________________________</w:t>
+        <w:t xml:space="preserve"> (fx kvinder, almindelige mennesker eller personer fra andre dele af verden). Hvad fortæller det om, hvem vi plejer at huske? _______________________________________________________________________________</w:t>
       </w:r>
     </w:p>
     <w:p>
-      <w:r>
-        <w:t xml:space="preserve">3. </w:t>
-      </w:r>
+      <w:pPr>
+        <w:pStyle w:val="ListNumber"/>
+      </w:pPr>
       <w:r>
         <w:rPr>
           <w:b/>

</xml_diff>

<commit_message>
Tilfoej kildebaserede, undersoegende elevmaterialer (uge 25)
- Nyt Elevark_Ondskab: undersoegende elevark med kilde-bank (Arendt, Job, Wiesel, religionsskema)
- Etiske dilemmaer: ikke-kristen etik (Mishna/Koranen 5,32, hadith) + nyt Dilemma 7
- Karakter-kamp: ny Undersoegelse D (eftermaele-kildekritik + kronologi)
- Rollespil: omskrevet til kildebaseret rollespil (kilder + kildekritik pr. scenarie)
- index.html: link til Elevark_Ondskab + opdateret rollespil-tekst
- .gitignore: hold ny laervejledning lokal

Co-Authored-By: Claude Opus 4.8 (1M context) <noreply@anthropic.com>
</commit_message>
<xml_diff>
--- a/Elevark_Karakter-kamp.docx
+++ b/Elevark_Karakter-kamp.docx
@@ -1286,6 +1286,372 @@
         <w:pStyle w:val="Heading2"/>
       </w:pPr>
       <w:r>
+        <w:t>Undersøgelse D — Eftermæle og kilder (kildekritik)</w:t>
+      </w:r>
+    </w:p>
+    <w:p>
+      <w:r>
+        <w:t xml:space="preserve">Et korts ⭐ </w:t>
+      </w:r>
+      <w:r>
+        <w:rPr>
+          <w:b/>
+        </w:rPr>
+        <w:t>Eftermæle</w:t>
+      </w:r>
+      <w:r>
+        <w:t xml:space="preserve"> er ikke en fast sandhed — det er noget, mennesker </w:t>
+      </w:r>
+      <w:r>
+        <w:rPr>
+          <w:i/>
+        </w:rPr>
+        <w:t>skriver</w:t>
+      </w:r>
+      <w:r>
+        <w:t xml:space="preserve">. Forskellige kilder fortæller tit vidt forskellige historier om den </w:t>
+      </w:r>
+      <w:r>
+        <w:rPr>
+          <w:b/>
+        </w:rPr>
+        <w:t>samme</w:t>
+      </w:r>
+      <w:r>
+        <w:t xml:space="preserve"> person. Det skal I undersøge.</w:t>
+      </w:r>
+    </w:p>
+    <w:p>
+      <w:r>
+        <w:rPr>
+          <w:b/>
+        </w:rPr>
+        <w:t>D1 — to fortællinger om én person.</w:t>
+      </w:r>
+      <w:r>
+        <w:t xml:space="preserve"> Vælg en omstridt person fra dækket — fx </w:t>
+      </w:r>
+      <w:r>
+        <w:rPr>
+          <w:b/>
+        </w:rPr>
+        <w:t>Christofer Columbus</w:t>
+      </w:r>
+      <w:r>
+        <w:t xml:space="preserve"> (helt og opdager? eller erobrer og kolonisator?). Find to korte kilder med hvert sit syn (slå op på lex.dk og danmarkshistorien.dk). Lav </w:t>
+      </w:r>
+      <w:r>
+        <w:rPr>
+          <w:b/>
+        </w:rPr>
+        <w:t>kildekritik</w:t>
+      </w:r>
+      <w:r>
+        <w:t xml:space="preserve"> af hver:</w:t>
+      </w:r>
+    </w:p>
+    <w:tbl>
+      <w:tblPr>
+        <w:tblStyle w:val="LightGrid-Accent1"/>
+        <w:tblW w:type="auto" w:w="0"/>
+        <w:tblLook w:firstColumn="1" w:firstRow="1" w:lastColumn="0" w:lastRow="0" w:noHBand="0" w:noVBand="1" w:val="04A0"/>
+      </w:tblPr>
+      <w:tblGrid>
+        <w:gridCol w:w="2880"/>
+        <w:gridCol w:w="2880"/>
+        <w:gridCol w:w="2880"/>
+      </w:tblGrid>
+      <w:tr>
+        <w:tc>
+          <w:tcPr>
+            <w:tcW w:type="dxa" w:w="2880"/>
+          </w:tcPr>
+          <w:p>
+            <w:r>
+              <w:rPr>
+                <w:b/>
+              </w:rPr>
+            </w:r>
+            <w:r>
+              <w:rPr>
+                <w:b/>
+              </w:rPr>
+              <w:t>Spørgsmål</w:t>
+            </w:r>
+          </w:p>
+        </w:tc>
+        <w:tc>
+          <w:tcPr>
+            <w:tcW w:type="dxa" w:w="2880"/>
+          </w:tcPr>
+          <w:p>
+            <w:r>
+              <w:rPr>
+                <w:b/>
+              </w:rPr>
+            </w:r>
+            <w:r>
+              <w:rPr>
+                <w:b/>
+              </w:rPr>
+              <w:t>Kilde 1</w:t>
+            </w:r>
+          </w:p>
+        </w:tc>
+        <w:tc>
+          <w:tcPr>
+            <w:tcW w:type="dxa" w:w="2880"/>
+          </w:tcPr>
+          <w:p>
+            <w:r>
+              <w:rPr>
+                <w:b/>
+              </w:rPr>
+            </w:r>
+            <w:r>
+              <w:rPr>
+                <w:b/>
+              </w:rPr>
+              <w:t>Kilde 2</w:t>
+            </w:r>
+          </w:p>
+        </w:tc>
+      </w:tr>
+      <w:tr>
+        <w:tc>
+          <w:tcPr>
+            <w:tcW w:type="dxa" w:w="2880"/>
+          </w:tcPr>
+          <w:p>
+            <w:r/>
+            <w:r>
+              <w:t>Hvem har lavet kilden (afsender)?</w:t>
+            </w:r>
+          </w:p>
+        </w:tc>
+        <w:tc>
+          <w:tcPr>
+            <w:tcW w:type="dxa" w:w="2880"/>
+          </w:tcPr>
+          <w:p>
+            <w:r/>
+          </w:p>
+        </w:tc>
+        <w:tc>
+          <w:tcPr>
+            <w:tcW w:type="dxa" w:w="2880"/>
+          </w:tcPr>
+          <w:p>
+            <w:r/>
+          </w:p>
+        </w:tc>
+      </w:tr>
+      <w:tr>
+        <w:tc>
+          <w:tcPr>
+            <w:tcW w:type="dxa" w:w="2880"/>
+          </w:tcPr>
+          <w:p>
+            <w:r/>
+            <w:r>
+              <w:t>Hvornår er den lavet?</w:t>
+            </w:r>
+          </w:p>
+        </w:tc>
+        <w:tc>
+          <w:tcPr>
+            <w:tcW w:type="dxa" w:w="2880"/>
+          </w:tcPr>
+          <w:p>
+            <w:r/>
+          </w:p>
+        </w:tc>
+        <w:tc>
+          <w:tcPr>
+            <w:tcW w:type="dxa" w:w="2880"/>
+          </w:tcPr>
+          <w:p>
+            <w:r/>
+          </w:p>
+        </w:tc>
+      </w:tr>
+      <w:tr>
+        <w:tc>
+          <w:tcPr>
+            <w:tcW w:type="dxa" w:w="2880"/>
+          </w:tcPr>
+          <w:p>
+            <w:r/>
+            <w:r>
+              <w:t>Hvad er formålet — hvad vil den have os til at mene?</w:t>
+            </w:r>
+          </w:p>
+        </w:tc>
+        <w:tc>
+          <w:tcPr>
+            <w:tcW w:type="dxa" w:w="2880"/>
+          </w:tcPr>
+          <w:p>
+            <w:r/>
+          </w:p>
+        </w:tc>
+        <w:tc>
+          <w:tcPr>
+            <w:tcW w:type="dxa" w:w="2880"/>
+          </w:tcPr>
+          <w:p>
+            <w:r/>
+          </w:p>
+        </w:tc>
+      </w:tr>
+      <w:tr>
+        <w:tc>
+          <w:tcPr>
+            <w:tcW w:type="dxa" w:w="2880"/>
+          </w:tcPr>
+          <w:p>
+            <w:r/>
+            <w:r>
+              <w:t xml:space="preserve">Hvilken </w:t>
+            </w:r>
+            <w:r>
+              <w:rPr>
+                <w:b/>
+              </w:rPr>
+              <w:t>tendens</w:t>
+            </w:r>
+            <w:r>
+              <w:t xml:space="preserve"> har den (hvad trækker den i)?</w:t>
+            </w:r>
+          </w:p>
+        </w:tc>
+        <w:tc>
+          <w:tcPr>
+            <w:tcW w:type="dxa" w:w="2880"/>
+          </w:tcPr>
+          <w:p>
+            <w:r/>
+          </w:p>
+        </w:tc>
+        <w:tc>
+          <w:tcPr>
+            <w:tcW w:type="dxa" w:w="2880"/>
+          </w:tcPr>
+          <w:p>
+            <w:r/>
+          </w:p>
+        </w:tc>
+      </w:tr>
+    </w:tbl>
+    <w:p>
+      <w:r>
+        <w:rPr>
+          <w:b/>
+        </w:rPr>
+        <w:t>Vurdér til sidst:</w:t>
+      </w:r>
+      <w:r>
+        <w:t xml:space="preserve"> Hvilken fortælling er mest </w:t>
+      </w:r>
+      <w:r>
+        <w:rPr>
+          <w:b/>
+        </w:rPr>
+        <w:t>lødig</w:t>
+      </w:r>
+      <w:r>
+        <w:t xml:space="preserve"> (troværdig og veldokumenteret)? Og hvilket ⭐ Eftermæle-tal ville I give personen nu, hvor I har læst begge sider? Begrund.</w:t>
+      </w:r>
+    </w:p>
+    <w:p>
+      <w:r>
+        <w:rPr>
+          <w:b/>
+        </w:rPr>
+        <w:t>D2 — fra tidslinje til sammenhæng.</w:t>
+      </w:r>
+      <w:r>
+        <w:t xml:space="preserve"> Vælg to personer fra jeres tidslinje. Forklar </w:t>
+      </w:r>
+      <w:r>
+        <w:rPr>
+          <w:b/>
+        </w:rPr>
+        <w:t>enten et brud</w:t>
+      </w:r>
+      <w:r>
+        <w:t xml:space="preserve"> ("før denne person tænkte man …, efter …") </w:t>
+      </w:r>
+      <w:r>
+        <w:rPr>
+          <w:b/>
+        </w:rPr>
+        <w:t>eller en kontinuitet</w:t>
+      </w:r>
+      <w:r>
+        <w:t xml:space="preserve"> ("de levede langt fra hinanden, men kæmpede for det samme"). Find mindst én </w:t>
+      </w:r>
+      <w:r>
+        <w:rPr>
+          <w:b/>
+        </w:rPr>
+        <w:t>årsag→følge</w:t>
+      </w:r>
+      <w:r>
+        <w:t>: hvordan påvirkede den ene tid den næste?</w:t>
+      </w:r>
+    </w:p>
+    <w:p>
+      <w:pPr>
+        <w:shd w:val="clear" w:fill="EEF1F6"/>
+        <w:ind w:left="259" w:right="144"/>
+      </w:pPr>
+      <w:r>
+        <w:rPr>
+          <w:b/>
+        </w:rPr>
+        <w:t>Slå op, og tjek fakta:</w:t>
+      </w:r>
+      <w:r>
+        <w:t xml:space="preserve"> </w:t>
+      </w:r>
+      <w:hyperlink r:id="rId9">
+        <w:r>
+          <w:rPr>
+            <w:color w:val="0563C1"/>
+            <w:u w:val="single"/>
+          </w:rPr>
+          <w:t xml:space="preserve">lex.dk</w:t>
+        </w:r>
+      </w:hyperlink>
+      <w:r>
+        <w:t xml:space="preserve"> (Den Store Danske) og </w:t>
+      </w:r>
+      <w:hyperlink r:id="rId10">
+        <w:r>
+          <w:rPr>
+            <w:color w:val="0563C1"/>
+            <w:u w:val="single"/>
+          </w:rPr>
+          <w:t xml:space="preserve">danmarkshistorien.dk</w:t>
+        </w:r>
+      </w:hyperlink>
+      <w:r>
+        <w:t xml:space="preserve"> (Aarhus Universitet). Skriv kun det, I har tjekket i en kilde.</w:t>
+      </w:r>
+    </w:p>
+    <w:p>
+      <w:pPr>
+        <w:pBdr>
+          <w:bottom w:val="single" w:sz="6" w:space="1" w:color="BBBBBB"/>
+        </w:pBdr>
+      </w:pPr>
+    </w:p>
+    <w:p>
+      <w:pPr>
+        <w:pStyle w:val="Heading2"/>
+      </w:pPr>
+      <w:r>
         <w:t>Tænk over det (skriv kort)</w:t>
       </w:r>
     </w:p>

</xml_diff>

<commit_message>
Humaniser elevmaterialer (naturligt sprog, faerre tankestreger)
Koer the-humanizer paa de fire publicerede elevmaterialer: reducer
tankestreg-overforbrug og glat AI-agtig kadence; bevar laerer-til-elev-tonen.
Ingen fakta, kilder, links, opgaver eller struktur aendret (verificeret:
tabeller/overskrifter uaendrede, alle kildehenvisninger intakte).

Co-Authored-By: Claude Opus 4.8 (1M context) <noreply@anthropic.com>
</commit_message>
<xml_diff>
--- a/Elevark_Karakter-kamp.docx
+++ b/Elevark_Karakter-kamp.docx
@@ -1300,7 +1300,7 @@
         <w:t>Eftermæle</w:t>
       </w:r>
       <w:r>
-        <w:t xml:space="preserve"> er ikke en fast sandhed — det er noget, mennesker </w:t>
+        <w:t xml:space="preserve"> er ingen fast sandhed. Det er noget, mennesker </w:t>
       </w:r>
       <w:r>
         <w:rPr>
@@ -1309,7 +1309,7 @@
         <w:t>skriver</w:t>
       </w:r>
       <w:r>
-        <w:t xml:space="preserve">. Forskellige kilder fortæller tit vidt forskellige historier om den </w:t>
+        <w:t xml:space="preserve">, og forskellige kilder fortæller tit vidt forskellige historier om den </w:t>
       </w:r>
       <w:r>
         <w:rPr>
@@ -1318,7 +1318,7 @@
         <w:t>samme</w:t>
       </w:r>
       <w:r>
-        <w:t xml:space="preserve"> person. Det skal I undersøge.</w:t>
+        <w:t xml:space="preserve"> person. Det skal I undersøge nærmere.</w:t>
       </w:r>
     </w:p>
     <w:p>
@@ -1326,10 +1326,10 @@
         <w:rPr>
           <w:b/>
         </w:rPr>
-        <w:t>D1 — to fortællinger om én person.</w:t>
+        <w:t>D1: to fortællinger om én person.</w:t>
       </w:r>
       <w:r>
-        <w:t xml:space="preserve"> Vælg en omstridt person fra dækket — fx </w:t>
+        <w:t xml:space="preserve"> Vælg en omstridt person fra dækket, for eksempel </w:t>
       </w:r>
       <w:r>
         <w:rPr>
@@ -1568,7 +1568,7 @@
         <w:rPr>
           <w:b/>
         </w:rPr>
-        <w:t>D2 — fra tidslinje til sammenhæng.</w:t>
+        <w:t>D2: fra tidslinje til sammenhæng.</w:t>
       </w:r>
       <w:r>
         <w:t xml:space="preserve"> Vælg to personer fra jeres tidslinje. Forklar </w:t>

</xml_diff>

<commit_message>
Forloebsvurdering: forbedringer i elevmaterialer + 2 nye Jeopardy-runder
- Tilfoejelser fra forloebsvurderingen skrevet ind (KK/historie/matematik):
  begrebsbank, indefra-opgave, kvalitetskrav, dilemma 7b, Arbejdsark E+F,
  modkilde + egen problemstilling, statistik-station + modellering
- Humaniseret sprog (faerre tankestreger) i de tilfoejede passager
- Jeopardy: ny Runde 3 (repetition) + Runde 4 (finale); runde-knap cykler nu
- .docx genbygget; facit og forloebsvurderinger holdes lokalt (gitignore)

Co-Authored-By: Claude Opus 4.8 (1M context) <noreply@anthropic.com>
</commit_message>
<xml_diff>
--- a/Elevark_Karakter-kamp.docx
+++ b/Elevark_Karakter-kamp.docx
@@ -394,6 +394,24 @@
       </w:r>
       <w:r>
         <w:t>. Spil 16 kort. Flest point vinder.</w:t>
+      </w:r>
+    </w:p>
+    <w:p>
+      <w:pPr>
+        <w:shd w:val="clear" w:fill="EEF1F6"/>
+        <w:ind w:left="259" w:right="144"/>
+      </w:pPr>
+      <w:r>
+        <w:t xml:space="preserve">💡 </w:t>
+      </w:r>
+      <w:r>
+        <w:rPr>
+          <w:b/>
+        </w:rPr>
+        <w:t>Fair spil (print-versionen):</w:t>
+      </w:r>
+      <w:r>
+        <w:t xml:space="preserve"> Forsiden viser også de fire stats, og ⏳ Alder hænger sammen med årstallet. Dæk de fire tal til med en finger eller en brik, mens I gætter placeringen, så I gætter ud fra navnet og jeres viden, ikke ud fra Alder-tallet.</w:t>
       </w:r>
     </w:p>
     <w:p>
@@ -1286,6 +1304,222 @@
         <w:pStyle w:val="Heading2"/>
       </w:pPr>
       <w:r>
+        <w:t>Arbejdsark E — Religionernes stiftere (kristendomskundskab)</w:t>
+      </w:r>
+    </w:p>
+    <w:p>
+      <w:r>
+        <w:t xml:space="preserve">Find de religiøse stiftere og centrale skikkelser i dækket (fx </w:t>
+      </w:r>
+      <w:r>
+        <w:rPr>
+          <w:b/>
+        </w:rPr>
+        <w:t>Jesus, Buddha, Muhammad, Moses, Abraham, Guru Nanak, Konfutse</w:t>
+      </w:r>
+      <w:r>
+        <w:t xml:space="preserve">). Vælg </w:t>
+      </w:r>
+      <w:r>
+        <w:rPr>
+          <w:b/>
+        </w:rPr>
+        <w:t>to fra hver sin religion</w:t>
+      </w:r>
+      <w:r>
+        <w:t>, og udfyld:</w:t>
+      </w:r>
+    </w:p>
+    <w:tbl>
+      <w:tblPr>
+        <w:tblStyle w:val="LightGrid-Accent1"/>
+        <w:tblW w:type="auto" w:w="0"/>
+        <w:tblLook w:firstColumn="1" w:firstRow="1" w:lastColumn="0" w:lastRow="0" w:noHBand="0" w:noVBand="1" w:val="04A0"/>
+      </w:tblPr>
+      <w:tblGrid>
+        <w:gridCol w:w="2160"/>
+        <w:gridCol w:w="2160"/>
+        <w:gridCol w:w="2160"/>
+        <w:gridCol w:w="2160"/>
+      </w:tblGrid>
+      <w:tr>
+        <w:tc>
+          <w:tcPr>
+            <w:tcW w:type="dxa" w:w="2160"/>
+          </w:tcPr>
+          <w:p>
+            <w:r>
+              <w:rPr>
+                <w:b/>
+              </w:rPr>
+            </w:r>
+            <w:r>
+              <w:rPr>
+                <w:b/>
+              </w:rPr>
+              <w:t>Person</w:t>
+            </w:r>
+          </w:p>
+        </w:tc>
+        <w:tc>
+          <w:tcPr>
+            <w:tcW w:type="dxa" w:w="2160"/>
+          </w:tcPr>
+          <w:p>
+            <w:r>
+              <w:rPr>
+                <w:b/>
+              </w:rPr>
+            </w:r>
+            <w:r>
+              <w:rPr>
+                <w:b/>
+              </w:rPr>
+              <w:t>Religion</w:t>
+            </w:r>
+          </w:p>
+        </w:tc>
+        <w:tc>
+          <w:tcPr>
+            <w:tcW w:type="dxa" w:w="2160"/>
+          </w:tcPr>
+          <w:p>
+            <w:r>
+              <w:rPr>
+                <w:b/>
+              </w:rPr>
+            </w:r>
+            <w:r>
+              <w:rPr>
+                <w:b/>
+              </w:rPr>
+              <w:t xml:space="preserve">Én </w:t>
+            </w:r>
+            <w:r>
+              <w:rPr>
+                <w:b/>
+              </w:rPr>
+              <w:t>hovedtanke</w:t>
+            </w:r>
+            <w:r>
+              <w:rPr>
+                <w:b/>
+              </w:rPr>
+              <w:t>, personen står for</w:t>
+            </w:r>
+          </w:p>
+        </w:tc>
+        <w:tc>
+          <w:tcPr>
+            <w:tcW w:type="dxa" w:w="2160"/>
+          </w:tcPr>
+          <w:p>
+            <w:r>
+              <w:rPr>
+                <w:b/>
+              </w:rPr>
+            </w:r>
+            <w:r>
+              <w:rPr>
+                <w:b/>
+              </w:rPr>
+              <w:t>Hvor ses den i dag? (en nutidig fremtrædelsesform)</w:t>
+            </w:r>
+          </w:p>
+        </w:tc>
+      </w:tr>
+      <w:tr>
+        <w:tc>
+          <w:tcPr>
+            <w:tcW w:type="dxa" w:w="2160"/>
+          </w:tcPr>
+          <w:p>
+            <w:r/>
+          </w:p>
+        </w:tc>
+        <w:tc>
+          <w:tcPr>
+            <w:tcW w:type="dxa" w:w="2160"/>
+          </w:tcPr>
+          <w:p>
+            <w:r/>
+          </w:p>
+        </w:tc>
+        <w:tc>
+          <w:tcPr>
+            <w:tcW w:type="dxa" w:w="2160"/>
+          </w:tcPr>
+          <w:p>
+            <w:r/>
+          </w:p>
+        </w:tc>
+        <w:tc>
+          <w:tcPr>
+            <w:tcW w:type="dxa" w:w="2160"/>
+          </w:tcPr>
+          <w:p>
+            <w:r/>
+          </w:p>
+        </w:tc>
+      </w:tr>
+      <w:tr>
+        <w:tc>
+          <w:tcPr>
+            <w:tcW w:type="dxa" w:w="2160"/>
+          </w:tcPr>
+          <w:p>
+            <w:r/>
+          </w:p>
+        </w:tc>
+        <w:tc>
+          <w:tcPr>
+            <w:tcW w:type="dxa" w:w="2160"/>
+          </w:tcPr>
+          <w:p>
+            <w:r/>
+          </w:p>
+        </w:tc>
+        <w:tc>
+          <w:tcPr>
+            <w:tcW w:type="dxa" w:w="2160"/>
+          </w:tcPr>
+          <w:p>
+            <w:r/>
+          </w:p>
+        </w:tc>
+        <w:tc>
+          <w:tcPr>
+            <w:tcW w:type="dxa" w:w="2160"/>
+          </w:tcPr>
+          <w:p>
+            <w:r/>
+          </w:p>
+        </w:tc>
+      </w:tr>
+    </w:tbl>
+    <w:p>
+      <w:r>
+        <w:rPr>
+          <w:b/>
+        </w:rPr>
+        <w:t>Forhold jer til:</w:t>
+      </w:r>
+      <w:r>
+        <w:t xml:space="preserve"> Hvad har de to hovedtanker til fælles, og hvor er de mest forskellige? Hvorfor tror I, netop disse tanker har holdt i tusinder af år?</w:t>
+      </w:r>
+    </w:p>
+    <w:p>
+      <w:pPr>
+        <w:pBdr>
+          <w:bottom w:val="single" w:sz="6" w:space="1" w:color="BBBBBB"/>
+        </w:pBdr>
+      </w:pPr>
+    </w:p>
+    <w:p>
+      <w:pPr>
+        <w:pStyle w:val="Heading2"/>
+      </w:pPr>
+      <w:r>
         <w:t>Undersøgelse D — Eftermæle og kilder (kildekritik)</w:t>
       </w:r>
     </w:p>
@@ -1608,6 +1842,21 @@
       </w:pPr>
       <w:r>
         <w:rPr>
+          <w:i/>
+        </w:rPr>
+        <w:t>Skriv jeres sammenhæng som en kæde:</w:t>
+      </w:r>
+      <w:r>
+        <w:t xml:space="preserve"> "Fordi [person 1] gjorde …, blev det muligt/nødvendigt for [person 2] at … — og det betyder for os i dag, at …"</w:t>
+      </w:r>
+    </w:p>
+    <w:p>
+      <w:pPr>
+        <w:shd w:val="clear" w:fill="EEF1F6"/>
+        <w:ind w:left="259" w:right="144"/>
+      </w:pPr>
+      <w:r>
+        <w:rPr>
           <w:b/>
         </w:rPr>
         <w:t>Slå op, og tjek fakta:</w:t>
@@ -1652,6 +1901,240 @@
         <w:pStyle w:val="Heading2"/>
       </w:pPr>
       <w:r>
+        <w:t>Arbejdsark F — Kanonen i dækket (historie)</w:t>
+      </w:r>
+    </w:p>
+    <w:p>
+      <w:r>
+        <w:t xml:space="preserve">Flere af de 52 personer knytter sig til historiekanonens 30 nedslag, bl.a. </w:t>
+      </w:r>
+      <w:r>
+        <w:rPr>
+          <w:b/>
+        </w:rPr>
+        <w:t>Harald Blåtand / Gorm den Gamle</w:t>
+      </w:r>
+      <w:r>
+        <w:t xml:space="preserve"> (Jellingstenen), </w:t>
+      </w:r>
+      <w:r>
+        <w:rPr>
+          <w:b/>
+        </w:rPr>
+        <w:t>Margrete 1.</w:t>
+      </w:r>
+      <w:r>
+        <w:t xml:space="preserve"> (Kalmarunionen), </w:t>
+      </w:r>
+      <w:r>
+        <w:rPr>
+          <w:b/>
+        </w:rPr>
+        <w:t>Columbus</w:t>
+      </w:r>
+      <w:r>
+        <w:t xml:space="preserve">, </w:t>
+      </w:r>
+      <w:r>
+        <w:rPr>
+          <w:b/>
+        </w:rPr>
+        <w:t>Martin Luther</w:t>
+      </w:r>
+      <w:r>
+        <w:t xml:space="preserve"> (Reformationen), </w:t>
+      </w:r>
+      <w:r>
+        <w:rPr>
+          <w:b/>
+        </w:rPr>
+        <w:t>Christian 4.</w:t>
+      </w:r>
+      <w:r>
+        <w:t xml:space="preserve"> og </w:t>
+      </w:r>
+      <w:r>
+        <w:rPr>
+          <w:b/>
+        </w:rPr>
+        <w:t>2.-verdenskrigs-personerne</w:t>
+      </w:r>
+      <w:r>
+        <w:t xml:space="preserve"> (Holocaust og jødeaktionen 1943). Vælg </w:t>
+      </w:r>
+      <w:r>
+        <w:rPr>
+          <w:b/>
+        </w:rPr>
+        <w:t>tre</w:t>
+      </w:r>
+      <w:r>
+        <w:t>, og udfyld:</w:t>
+      </w:r>
+    </w:p>
+    <w:tbl>
+      <w:tblPr>
+        <w:tblStyle w:val="LightGrid-Accent1"/>
+        <w:tblW w:type="auto" w:w="0"/>
+        <w:tblLook w:firstColumn="1" w:firstRow="1" w:lastColumn="0" w:lastRow="0" w:noHBand="0" w:noVBand="1" w:val="04A0"/>
+      </w:tblPr>
+      <w:tblGrid>
+        <w:gridCol w:w="2880"/>
+        <w:gridCol w:w="2880"/>
+        <w:gridCol w:w="2880"/>
+      </w:tblGrid>
+      <w:tr>
+        <w:tc>
+          <w:tcPr>
+            <w:tcW w:type="dxa" w:w="2880"/>
+          </w:tcPr>
+          <w:p>
+            <w:r>
+              <w:rPr>
+                <w:b/>
+              </w:rPr>
+            </w:r>
+            <w:r>
+              <w:rPr>
+                <w:b/>
+              </w:rPr>
+              <w:t>Person</w:t>
+            </w:r>
+          </w:p>
+        </w:tc>
+        <w:tc>
+          <w:tcPr>
+            <w:tcW w:type="dxa" w:w="2880"/>
+          </w:tcPr>
+          <w:p>
+            <w:r>
+              <w:rPr>
+                <w:b/>
+              </w:rPr>
+            </w:r>
+            <w:r>
+              <w:rPr>
+                <w:b/>
+              </w:rPr>
+              <w:t>Kanon-nedslag</w:t>
+            </w:r>
+          </w:p>
+        </w:tc>
+        <w:tc>
+          <w:tcPr>
+            <w:tcW w:type="dxa" w:w="2880"/>
+          </w:tcPr>
+          <w:p>
+            <w:r>
+              <w:rPr>
+                <w:b/>
+              </w:rPr>
+            </w:r>
+            <w:r>
+              <w:rPr>
+                <w:b/>
+              </w:rPr>
+              <w:t>Hvorfor er netop dét nedslag vigtigt for at forstå sammenhæng i historien?</w:t>
+            </w:r>
+          </w:p>
+        </w:tc>
+      </w:tr>
+      <w:tr>
+        <w:tc>
+          <w:tcPr>
+            <w:tcW w:type="dxa" w:w="2880"/>
+          </w:tcPr>
+          <w:p>
+            <w:r/>
+          </w:p>
+        </w:tc>
+        <w:tc>
+          <w:tcPr>
+            <w:tcW w:type="dxa" w:w="2880"/>
+          </w:tcPr>
+          <w:p>
+            <w:r/>
+          </w:p>
+        </w:tc>
+        <w:tc>
+          <w:tcPr>
+            <w:tcW w:type="dxa" w:w="2880"/>
+          </w:tcPr>
+          <w:p>
+            <w:r/>
+          </w:p>
+        </w:tc>
+      </w:tr>
+      <w:tr>
+        <w:tc>
+          <w:tcPr>
+            <w:tcW w:type="dxa" w:w="2880"/>
+          </w:tcPr>
+          <w:p>
+            <w:r/>
+          </w:p>
+        </w:tc>
+        <w:tc>
+          <w:tcPr>
+            <w:tcW w:type="dxa" w:w="2880"/>
+          </w:tcPr>
+          <w:p>
+            <w:r/>
+          </w:p>
+        </w:tc>
+        <w:tc>
+          <w:tcPr>
+            <w:tcW w:type="dxa" w:w="2880"/>
+          </w:tcPr>
+          <w:p>
+            <w:r/>
+          </w:p>
+        </w:tc>
+      </w:tr>
+      <w:tr>
+        <w:tc>
+          <w:tcPr>
+            <w:tcW w:type="dxa" w:w="2880"/>
+          </w:tcPr>
+          <w:p>
+            <w:r/>
+          </w:p>
+        </w:tc>
+        <w:tc>
+          <w:tcPr>
+            <w:tcW w:type="dxa" w:w="2880"/>
+          </w:tcPr>
+          <w:p>
+            <w:r/>
+          </w:p>
+        </w:tc>
+        <w:tc>
+          <w:tcPr>
+            <w:tcW w:type="dxa" w:w="2880"/>
+          </w:tcPr>
+          <w:p>
+            <w:r/>
+          </w:p>
+        </w:tc>
+      </w:tr>
+    </w:tbl>
+    <w:p>
+      <w:r>
+        <w:t>Placér til sidst jeres tre personer på en fælles tidslinje sammen med klassens øvrige kanonpunkter.</w:t>
+      </w:r>
+    </w:p>
+    <w:p>
+      <w:pPr>
+        <w:pBdr>
+          <w:bottom w:val="single" w:sz="6" w:space="1" w:color="BBBBBB"/>
+        </w:pBdr>
+      </w:pPr>
+    </w:p>
+    <w:p>
+      <w:pPr>
+        <w:pStyle w:val="Heading2"/>
+      </w:pPr>
+      <w:r>
         <w:t>Tænk over det (skriv kort)</w:t>
       </w:r>
     </w:p>
@@ -1680,7 +2163,25 @@
         <w:t>Kig på de 52 kort. Hvem mangler?</w:t>
       </w:r>
       <w:r>
-        <w:t xml:space="preserve"> (fx kvinder, almindelige mennesker eller personer fra andre dele af verden). Hvad fortæller det om, hvem vi plejer at huske? _______________________________________________________________________________</w:t>
+        <w:t xml:space="preserve"> (fx kvinder, almindelige mennesker eller personer fra andre dele af verden). Hvad fortæller det om, hvem vi plejer at huske? </w:t>
+      </w:r>
+      <w:r>
+        <w:rPr>
+          <w:b/>
+        </w:rPr>
+        <w:t>Tillæg:</w:t>
+      </w:r>
+      <w:r>
+        <w:t xml:space="preserve"> Kig særligt på de </w:t>
+      </w:r>
+      <w:r>
+        <w:rPr>
+          <w:b/>
+        </w:rPr>
+        <w:t>religiøse</w:t>
+      </w:r>
+      <w:r>
+        <w:t xml:space="preserve"> personer i dækket — er alle de store verdensreligioner med? Hvilke mangler, og hvad fortæller udvalget om, hvilke religioner vi i Danmark kender bedst? _______________________________________________________________________________</w:t>
       </w:r>
     </w:p>
     <w:p>

</xml_diff>